<commit_message>
App: explicit delete-item button with confirmation (connected only); report: mobile-app comparison, hedge survey claims
Co-Authored-By: Claude Sonnet 5.5 <noreply@anthropic.com>
Claude-Session: https://claude.ai/code/session_01Sscac89Z6gGAA6gjTxH9m6
</commit_message>
<xml_diff>
--- a/docs/report/SmartPack_Project_Report.docx
+++ b/docs/report/SmartPack_Project_Report.docx
@@ -981,7 +981,7 @@
               <w:sz w:val="24"/>
               <w:szCs w:val="24"/>
             </w:rPr>
-            <w:t>1</w:t>
+            <w:t>2</w:t>
           </w:r>
         </w:p>
         <w:p>
@@ -1047,7 +1047,7 @@
               <w:sz w:val="24"/>
               <w:szCs w:val="24"/>
             </w:rPr>
-            <w:t>2</w:t>
+            <w:t>3</w:t>
           </w:r>
         </w:p>
         <w:p>
@@ -1202,7 +1202,7 @@
               <w:sz w:val="24"/>
               <w:szCs w:val="24"/>
             </w:rPr>
-            <w:t xml:space="preserve">2.3 Summary of the Gap</w:t>
+            <w:t xml:space="preserve">2.3 Mobile Applications in Related Work</w:t>
           </w:r>
           <w:r>
             <w:rPr>
@@ -1219,6 +1219,39 @@
               <w:szCs w:val="24"/>
             </w:rPr>
             <w:t>5</w:t>
+          </w:r>
+        </w:p>
+        <w:p>
+          <w:pPr>
+            <w:tabs>
+              <w:tab w:val="right" w:leader="dot" w:pos="8306"/>
+            </w:tabs>
+            <w:spacing w:after="80"/>
+            <w:ind w:left="360"/>
+          </w:pPr>
+          <w:r>
+            <w:rPr>
+              <w:rFonts w:ascii="Times New Roman" w:cs="Times New Roman" w:eastAsia="Times New Roman" w:hAnsi="Times New Roman"/>
+              <w:sz w:val="24"/>
+              <w:szCs w:val="24"/>
+            </w:rPr>
+            <w:t xml:space="preserve">2.4 Summary of the Gap</w:t>
+          </w:r>
+          <w:r>
+            <w:rPr>
+              <w:rFonts w:ascii="Times New Roman" w:cs="Times New Roman" w:eastAsia="Times New Roman" w:hAnsi="Times New Roman"/>
+              <w:sz w:val="24"/>
+              <w:szCs w:val="24"/>
+            </w:rPr>
+            <w:tab/>
+          </w:r>
+          <w:r>
+            <w:rPr>
+              <w:rFonts w:ascii="Times New Roman" w:cs="Times New Roman" w:eastAsia="Times New Roman" w:hAnsi="Times New Roman"/>
+              <w:sz w:val="24"/>
+              <w:szCs w:val="24"/>
+            </w:rPr>
+            <w:t>6</w:t>
           </w:r>
         </w:p>
         <w:p>
@@ -3323,7 +3356,7 @@
           <w:sz w:val="24"/>
           <w:szCs w:val="24"/>
         </w:rPr>
-        <w:t xml:space="preserve">Bluetooth item trackers such as Tile and AirTag only help to find a lost item after the owner notices it is missing; they do not check a bag before the owner leaves. RFID inventory systems, on the other hand, are designed for warehouses, airports and logistics rather than for one person managing a few personal bags [17], [2], [10]. Research prototypes of RFID smart bags exist [16], [5], [1], [13], but they typically keep the reader powered continuously or scan when an item is placed, and none uses the act of closing the compartment as the event that triggers verification.</w:t>
+        <w:t xml:space="preserve">Bluetooth item trackers such as Tile and AirTag only help to find a lost item after the owner notices it is missing; they do not check a bag before the owner leaves. RFID inventory systems, on the other hand, are designed for warehouses, airports and logistics rather than for one person managing a few personal bags [17], [2], [10]. Research prototypes of RFID smart bags exist [16], [5], [1], [13], but they typically keep the reader powered continuously or scan when an item is placed, and none of the works reviewed uses the act of closing a compartment as the event that triggers verification.</w:t>
       </w:r>
     </w:p>
     <w:p>
@@ -5932,7 +5965,7 @@
         <w:rPr>
           <w:rFonts w:ascii="Times New Roman" w:cs="Times New Roman" w:eastAsia="Times New Roman" w:hAnsi="Times New Roman"/>
         </w:rPr>
-        <w:t xml:space="preserve">2.3 Summary of the Gap</w:t>
+        <w:t xml:space="preserve">2.3 Mobile Applications in Related Work</w:t>
       </w:r>
     </w:p>
     <w:p>
@@ -5946,7 +5979,46 @@
           <w:sz w:val="24"/>
           <w:szCs w:val="24"/>
         </w:rPr>
-        <w:t xml:space="preserve">Table 2 groups the surveyed approaches by what triggers the check. Most keep the reader on continuously or scan when an item is placed, and several target airports or warehouses. None of the surveyed systems uses the closing of a compartment as the trigger for verification, and none combines per-compartment readers with a crossing-based in/out model managed from a phone application.</w:t>
+        <w:t xml:space="preserve">Only some of the surveyed works include a phone application. The log bag of Mohd Yazed and Mahmud [13] saves its in/out log on an SD card and shows it in an Android application; Calo et al. [4] pair a base device with a companion mobile application that notifies the user when an item is missing; and IPURSE [19] is built on a mobile platform that alerts the user and takes context such as the calendar and weather into account. Chauhan and Nigam [5] report alerts and location sharing. For the remaining works, the descriptions available in this survey mention local alerts, tracking or logistics features rather than an application for managing the items of a bag.</w:t>
+      </w:r>
+    </w:p>
+    <w:p>
+      <w:pPr>
+        <w:spacing w:after="120" w:line="360"/>
+        <w:jc w:val="both"/>
+      </w:pPr>
+      <w:r>
+        <w:rPr>
+          <w:rFonts w:ascii="Times New Roman" w:cs="Times New Roman" w:eastAsia="Times New Roman" w:hAnsi="Times New Roman"/>
+          <w:sz w:val="24"/>
+          <w:szCs w:val="24"/>
+        </w:rPr>
+        <w:t xml:space="preserve">SmartPack’s application is concerned with managing the bag rather than only displaying alerts. It keeps the item library and names on the phone, adds items by tap-to-enrol, supports several compartments, shows the live in/out state of every item, synchronises with the bag at each connection, lets the user rename compartments, correct an item’s state and delete items, and names the missing items when a compartment is closed.</w:t>
+      </w:r>
+    </w:p>
+    <w:p>
+      <w:pPr>
+        <w:pStyle w:val="Heading2"/>
+      </w:pPr>
+      <w:r>
+        <w:rPr>
+          <w:rFonts w:ascii="Times New Roman" w:cs="Times New Roman" w:eastAsia="Times New Roman" w:hAnsi="Times New Roman"/>
+        </w:rPr>
+        <w:t xml:space="preserve">2.4 Summary of the Gap</w:t>
+      </w:r>
+    </w:p>
+    <w:p>
+      <w:pPr>
+        <w:spacing w:after="120" w:line="360"/>
+        <w:jc w:val="both"/>
+      </w:pPr>
+      <w:r>
+        <w:rPr>
+          <w:rFonts w:ascii="Times New Roman" w:cs="Times New Roman" w:eastAsia="Times New Roman" w:hAnsi="Times New Roman"/>
+          <w:sz w:val="24"/>
+          <w:szCs w:val="24"/>
+        </w:rPr>
+        <w:t xml:space="preserve">Table 2 groups the surveyed approaches by what triggers the check. Most keep the reader on continuously or scan when an item is placed, and several target airports or warehouses. None of the surveyed systems, as described in the sources reviewed, uses the closing of a compartment as the trigger for verification, and none is described as combining per-compartment readers with a crossing-based in/out model managed from a phone application. This comparison rests on the abstracts and descriptions of the works and should be rechecked against their full texts.</w:t>
       </w:r>
     </w:p>
     <w:p>
@@ -14316,7 +14388,7 @@
           <w:sz w:val="24"/>
           <w:szCs w:val="24"/>
         </w:rPr>
-        <w:t xml:space="preserve">, types a name such as “Wallet” and then taps the tag on that bag’s reader. The app sends ENROLL, the bag replies ENROLLED with the tag’s UID, and the app stores the name and UID together. The new item starts as outside; its first scan puts it inside. Figure 4 shows the sequence. A compartment can be renamed by tapping its title, and an item is removed by swiping it away, which also sends a DEL command to the bag.</w:t>
+        <w:t xml:space="preserve">, types a name such as “Wallet” and then taps the tag on that bag’s reader. The app sends ENROLL, the bag replies ENROLLED with the tag’s UID, and the app stores the name and UID together. The new item starts as outside; its first scan puts it inside. Figure 4 shows the sequence. A compartment can be renamed by tapping its title. An item is deleted with the bin icon on its row, after a confirmation dialog; the app then sends a DEL command to the bag and removes the item from the phone. Deletion is allowed only while the app is connected to the bag, so that the two never disagree about which tags are assigned.</w:t>
       </w:r>
     </w:p>
     <w:p>

</xml_diff>

<commit_message>
Make compartment count configurable (wiring table + build setting); report describes 2-compartment prototype and scaling
Co-Authored-By: Claude Sonnet 5.5 <noreply@anthropic.com>
Claude-Session: https://claude.ai/code/session_01Sscac89Z6gGAA6gjTxH9m6
</commit_message>
<xml_diff>
--- a/docs/report/SmartPack_Project_Report.docx
+++ b/docs/report/SmartPack_Project_Report.docx
@@ -612,7 +612,7 @@
           <w:sz w:val="24"/>
           <w:szCs w:val="24"/>
         </w:rPr>
-        <w:t xml:space="preserve">Forgetting essential items such as a wallet, keys, a charger or documents when leaving home is a common everyday problem, and existing item trackers only help to locate an object after the owner has noticed that it is missing. This project presents SmartPack, a low-cost smart bag built around an ESP32 microcontroller that verifies the contents of each compartment at the moment the compartment is closed. Every compartment has its own MFRC522 13.56 MHz RFID reader and a magnetic reed switch, and every item carries a passive RFID tag.</w:t>
+        <w:t xml:space="preserve">Forgetting essential items such as a wallet, keys, a charger or documents when leaving home is a common everyday problem, and existing item trackers only help to locate an object after the owner has noticed that it is missing. This project presents SmartPack, a low-cost smart bag built around an ESP32 microcontroller that verifies the contents of each compartment at the moment the compartment is closed. The prototype has two compartments, each with its own MFRC522 13.56 MHz RFID reader and magnetic reed switch, and the design extends to more compartments by adding one reader, one reed switch and one wiring-table row for each. Every item carries a passive RFID tag.</w:t>
       </w:r>
     </w:p>
     <w:p>
@@ -1389,7 +1389,7 @@
               <w:sz w:val="24"/>
               <w:szCs w:val="24"/>
             </w:rPr>
-            <w:t>9</w:t>
+            <w:t>10</w:t>
           </w:r>
         </w:p>
         <w:p>
@@ -1422,7 +1422,7 @@
               <w:sz w:val="24"/>
               <w:szCs w:val="24"/>
             </w:rPr>
-            <w:t>10</w:t>
+            <w:t>11</w:t>
           </w:r>
         </w:p>
         <w:p>
@@ -1455,7 +1455,7 @@
               <w:sz w:val="24"/>
               <w:szCs w:val="24"/>
             </w:rPr>
-            <w:t>12</w:t>
+            <w:t>13</w:t>
           </w:r>
         </w:p>
         <w:p>
@@ -1488,7 +1488,7 @@
               <w:sz w:val="24"/>
               <w:szCs w:val="24"/>
             </w:rPr>
-            <w:t>12</w:t>
+            <w:t>13</w:t>
           </w:r>
         </w:p>
         <w:p>
@@ -1521,7 +1521,7 @@
               <w:sz w:val="24"/>
               <w:szCs w:val="24"/>
             </w:rPr>
-            <w:t>13</w:t>
+            <w:t>14</w:t>
           </w:r>
         </w:p>
         <w:p>
@@ -1554,7 +1554,7 @@
               <w:sz w:val="24"/>
               <w:szCs w:val="24"/>
             </w:rPr>
-            <w:t>14</w:t>
+            <w:t>15</w:t>
           </w:r>
         </w:p>
         <w:p>
@@ -1593,7 +1593,7 @@
               <w:sz w:val="24"/>
               <w:szCs w:val="24"/>
             </w:rPr>
-            <w:t>16</w:t>
+            <w:t>18</w:t>
           </w:r>
         </w:p>
         <w:p>
@@ -1626,7 +1626,7 @@
               <w:sz w:val="24"/>
               <w:szCs w:val="24"/>
             </w:rPr>
-            <w:t>16</w:t>
+            <w:t>18</w:t>
           </w:r>
         </w:p>
         <w:p>
@@ -1659,7 +1659,7 @@
               <w:sz w:val="24"/>
               <w:szCs w:val="24"/>
             </w:rPr>
-            <w:t>16</w:t>
+            <w:t>18</w:t>
           </w:r>
         </w:p>
         <w:p>
@@ -1692,7 +1692,7 @@
               <w:sz w:val="24"/>
               <w:szCs w:val="24"/>
             </w:rPr>
-            <w:t>17</w:t>
+            <w:t>19</w:t>
           </w:r>
         </w:p>
         <w:p>
@@ -1731,7 +1731,7 @@
               <w:sz w:val="24"/>
               <w:szCs w:val="24"/>
             </w:rPr>
-            <w:t>18</w:t>
+            <w:t>21</w:t>
           </w:r>
         </w:p>
         <w:p>
@@ -1764,7 +1764,7 @@
               <w:sz w:val="24"/>
               <w:szCs w:val="24"/>
             </w:rPr>
-            <w:t>18</w:t>
+            <w:t>21</w:t>
           </w:r>
         </w:p>
         <w:p>
@@ -1797,7 +1797,7 @@
               <w:sz w:val="24"/>
               <w:szCs w:val="24"/>
             </w:rPr>
-            <w:t>18</w:t>
+            <w:t>21</w:t>
           </w:r>
         </w:p>
         <w:p>
@@ -1830,7 +1830,7 @@
               <w:sz w:val="24"/>
               <w:szCs w:val="24"/>
             </w:rPr>
-            <w:t>20</w:t>
+            <w:t>23</w:t>
           </w:r>
         </w:p>
         <w:p>
@@ -1869,7 +1869,7 @@
               <w:sz w:val="24"/>
               <w:szCs w:val="24"/>
             </w:rPr>
-            <w:t>22</w:t>
+            <w:t>25</w:t>
           </w:r>
         </w:p>
         <w:p>
@@ -1902,7 +1902,7 @@
               <w:sz w:val="24"/>
               <w:szCs w:val="24"/>
             </w:rPr>
-            <w:t>22</w:t>
+            <w:t>25</w:t>
           </w:r>
         </w:p>
         <w:p>
@@ -1935,7 +1935,7 @@
               <w:sz w:val="24"/>
               <w:szCs w:val="24"/>
             </w:rPr>
-            <w:t>22</w:t>
+            <w:t>25</w:t>
           </w:r>
         </w:p>
         <w:p>
@@ -1974,7 +1974,7 @@
               <w:sz w:val="24"/>
               <w:szCs w:val="24"/>
             </w:rPr>
-            <w:t>23</w:t>
+            <w:t>26</w:t>
           </w:r>
         </w:p>
         <w:p>
@@ -2022,7 +2022,7 @@
               <w:sz w:val="24"/>
               <w:szCs w:val="24"/>
             </w:rPr>
-            <w:t xml:space="preserve">Figure 1: System architecture of SmartPack</w:t>
+            <w:t xml:space="preserve">Figure 1: System architecture of SmartPack (prototype with two compartments)</w:t>
           </w:r>
           <w:r>
             <w:rPr>
@@ -2071,7 +2071,7 @@
               <w:sz w:val="24"/>
               <w:szCs w:val="24"/>
             </w:rPr>
-            <w:t>9</w:t>
+            <w:t>10</w:t>
           </w:r>
         </w:p>
         <w:p>
@@ -2104,7 +2104,7 @@
               <w:sz w:val="24"/>
               <w:szCs w:val="24"/>
             </w:rPr>
-            <w:t>11</w:t>
+            <w:t>12</w:t>
           </w:r>
         </w:p>
         <w:p>
@@ -2137,7 +2137,7 @@
               <w:sz w:val="24"/>
               <w:szCs w:val="24"/>
             </w:rPr>
-            <w:t>15</w:t>
+            <w:t>16</w:t>
           </w:r>
         </w:p>
         <w:p>
@@ -2333,7 +2333,7 @@
               <w:sz w:val="24"/>
               <w:szCs w:val="24"/>
             </w:rPr>
-            <w:t>10</w:t>
+            <w:t>11</w:t>
           </w:r>
         </w:p>
         <w:p>
@@ -2366,7 +2366,7 @@
               <w:sz w:val="24"/>
               <w:szCs w:val="24"/>
             </w:rPr>
-            <w:t>12</w:t>
+            <w:t>13</w:t>
           </w:r>
         </w:p>
         <w:p>
@@ -2399,7 +2399,7 @@
               <w:sz w:val="24"/>
               <w:szCs w:val="24"/>
             </w:rPr>
-            <w:t>13</w:t>
+            <w:t>14</w:t>
           </w:r>
         </w:p>
         <w:p>
@@ -2432,7 +2432,7 @@
               <w:sz w:val="24"/>
               <w:szCs w:val="24"/>
             </w:rPr>
-            <w:t>13</w:t>
+            <w:t>15</w:t>
           </w:r>
         </w:p>
         <w:p>
@@ -2465,7 +2465,7 @@
               <w:sz w:val="24"/>
               <w:szCs w:val="24"/>
             </w:rPr>
-            <w:t>16</w:t>
+            <w:t>18</w:t>
           </w:r>
         </w:p>
         <w:p>
@@ -2498,7 +2498,7 @@
               <w:sz w:val="24"/>
               <w:szCs w:val="24"/>
             </w:rPr>
-            <w:t>17</w:t>
+            <w:t>19</w:t>
           </w:r>
         </w:p>
         <w:p>
@@ -2531,7 +2531,7 @@
               <w:sz w:val="24"/>
               <w:szCs w:val="24"/>
             </w:rPr>
-            <w:t>18</w:t>
+            <w:t>21</w:t>
           </w:r>
         </w:p>
         <w:p>
@@ -2564,7 +2564,7 @@
               <w:sz w:val="24"/>
               <w:szCs w:val="24"/>
             </w:rPr>
-            <w:t>19</w:t>
+            <w:t>22</w:t>
           </w:r>
         </w:p>
         <w:p>
@@ -2597,7 +2597,7 @@
               <w:sz w:val="24"/>
               <w:szCs w:val="24"/>
             </w:rPr>
-            <w:t>19</w:t>
+            <w:t>22</w:t>
           </w:r>
         </w:p>
         <w:p>
@@ -2630,7 +2630,7 @@
               <w:sz w:val="24"/>
               <w:szCs w:val="24"/>
             </w:rPr>
-            <w:t>19</w:t>
+            <w:t>22</w:t>
           </w:r>
         </w:p>
         <w:p>
@@ -2663,7 +2663,7 @@
               <w:sz w:val="24"/>
               <w:szCs w:val="24"/>
             </w:rPr>
-            <w:t>19</w:t>
+            <w:t>22</w:t>
           </w:r>
         </w:p>
         <w:p>
@@ -3386,7 +3386,7 @@
           <w:sz w:val="24"/>
           <w:szCs w:val="24"/>
         </w:rPr>
-        <w:t xml:space="preserve">Design an ESP32-based bag with an independent RFID reader and reed switch for each compartment.</w:t>
+        <w:t xml:space="preserve">Design an ESP32-based bag with an independent RFID reader and reed switch for each compartment (two in the prototype), in a way that extends to more compartments.</w:t>
       </w:r>
     </w:p>
     <w:p>
@@ -3615,7 +3615,7 @@
           <w:sz w:val="24"/>
           <w:szCs w:val="24"/>
         </w:rPr>
-        <w:t xml:space="preserve"> Each compartment has its own reader and reed switch, so a bag with several compartments is verified compartment by compartment.</w:t>
+        <w:t xml:space="preserve"> Each compartment has its own reader and reed switch, so a bag with several compartments is verified compartment by compartment. The prototype has two compartments; the number is a build setting, so the same design extends to more.</w:t>
       </w:r>
     </w:p>
     <w:p>
@@ -3723,7 +3723,7 @@
           <w:sz w:val="24"/>
           <w:szCs w:val="24"/>
         </w:rPr>
-        <w:t xml:space="preserve">The prototype supports one bag with two compartments, up to sixteen tagged items per compartment, a single phone connection at a time, and Android and iOS applications built from one Flutter code base. The report covers the hardware design, the firmware, the BLE protocol and the application. Quantitative field results are not reported because the hardware trials are still to be carried out; Chapter 5 states precisely what has been verified so far and what remains.</w:t>
+        <w:t xml:space="preserve">The prototype is built with two compartments and supports up to sixteen tagged items per compartment, a single phone connection at a time, and Android and iOS applications built from one Flutter code base. The number of compartments is a build setting rather than a fixed property of the design (Section 3.2.4), but configurations with more than two compartments have not been built or tested on hardware. The report covers the hardware design, the firmware, the BLE protocol and the application. Quantitative field results are not reported because the hardware trials are still to be carried out; Chapter 5 states precisely what has been verified so far and what remains.</w:t>
       </w:r>
     </w:p>
     <w:p>
@@ -6867,7 +6867,7 @@
           <wp:inline distT="0" distB="0" distL="0" distR="0">
             <wp:extent cx="4953000" cy="5514975"/>
             <wp:effectExtent t="0" r="0" b="0" l="0"/>
-            <wp:docPr id="1" name="Figure" descr="System architecture of SmartPack" title="Figure: System architecture of SmartPack"/>
+            <wp:docPr id="1" name="Figure" descr="System architecture of SmartPack (prototype with two compartments)" title="Figure: System architecture of SmartPack (prototype with two compartments)"/>
             <wp:cNvGraphicFramePr>
               <a:graphicFrameLocks xmlns:a="http://schemas.openxmlformats.org/drawingml/2006/main" noChangeAspect="1"/>
             </wp:cNvGraphicFramePr>
@@ -6950,7 +6950,7 @@
           <w:sz w:val="22"/>
           <w:szCs w:val="22"/>
         </w:rPr>
-        <w:t xml:space="preserve">: System architecture of SmartPack</w:t>
+        <w:t xml:space="preserve">: System architecture of SmartPack (prototype with two compartments)</w:t>
       </w:r>
     </w:p>
     <w:p>
@@ -9821,6 +9821,161 @@
           <w:szCs w:val="24"/>
         </w:rPr>
         <w:t xml:space="preserve">The Li-Po battery charges through a TP4056 module. An MT3608 boost converter, adjusted with a multimeter to approximately 5.0 V before the ESP32 is connected, feeds the ESP32 VIN pin. The MFRC522 modules are powered only from the ESP32’s 3.3 V pin, which is a hard safety rule because the readers are damaged by 5 V. All grounds are common.</w:t>
+      </w:r>
+    </w:p>
+    <w:p>
+      <w:pPr>
+        <w:pStyle w:val="Heading3"/>
+      </w:pPr>
+      <w:r>
+        <w:rPr>
+          <w:rFonts w:ascii="Times New Roman" w:cs="Times New Roman" w:eastAsia="Times New Roman" w:hAnsi="Times New Roman"/>
+        </w:rPr>
+        <w:t xml:space="preserve">3.2.4 Scaling to More Compartments</w:t>
+      </w:r>
+    </w:p>
+    <w:p>
+      <w:pPr>
+        <w:spacing w:after="120" w:line="360"/>
+        <w:jc w:val="both"/>
+      </w:pPr>
+      <w:r>
+        <w:rPr>
+          <w:rFonts w:ascii="Times New Roman" w:cs="Times New Roman" w:eastAsia="Times New Roman" w:hAnsi="Times New Roman"/>
+          <w:sz w:val="24"/>
+          <w:szCs w:val="24"/>
+        </w:rPr>
+        <w:t xml:space="preserve">The prototype uses two compartments, but nothing in the design is specific to the number two. Everything that belongs to a compartment (its reader, its reed switch, its item list and its closure check) is addressed by a compartment index, and the number of compartments is a single build setting. Adding a compartment takes four steps:</w:t>
+      </w:r>
+    </w:p>
+    <w:p>
+      <w:pPr>
+        <w:pStyle w:val="ListParagraph"/>
+        <w:numPr>
+          <w:ilvl w:val="0"/>
+          <w:numId w:val="2"/>
+        </w:numPr>
+        <w:spacing w:after="60" w:line="336"/>
+        <w:jc w:val="both"/>
+      </w:pPr>
+      <w:r>
+        <w:rPr>
+          <w:rFonts w:ascii="Times New Roman" w:cs="Times New Roman" w:eastAsia="Times New Roman" w:hAnsi="Times New Roman"/>
+          <w:b/>
+          <w:bCs/>
+          <w:sz w:val="24"/>
+          <w:szCs w:val="24"/>
+        </w:rPr>
+        <w:t xml:space="preserve">Hardware.</w:t>
+      </w:r>
+      <w:r>
+        <w:rPr>
+          <w:rFonts w:ascii="Times New Roman" w:cs="Times New Roman" w:eastAsia="Times New Roman" w:hAnsi="Times New Roman"/>
+          <w:sz w:val="24"/>
+          <w:szCs w:val="24"/>
+        </w:rPr>
+        <w:t xml:space="preserve"> Connect another MFRC522 reader to the shared SPI bus with its own slave-select and reset pins, and another reed switch to a free GPIO.</w:t>
+      </w:r>
+    </w:p>
+    <w:p>
+      <w:pPr>
+        <w:pStyle w:val="ListParagraph"/>
+        <w:numPr>
+          <w:ilvl w:val="0"/>
+          <w:numId w:val="2"/>
+        </w:numPr>
+        <w:spacing w:after="60" w:line="336"/>
+        <w:jc w:val="both"/>
+      </w:pPr>
+      <w:r>
+        <w:rPr>
+          <w:rFonts w:ascii="Times New Roman" w:cs="Times New Roman" w:eastAsia="Times New Roman" w:hAnsi="Times New Roman"/>
+          <w:b/>
+          <w:bCs/>
+          <w:sz w:val="24"/>
+          <w:szCs w:val="24"/>
+        </w:rPr>
+        <w:t xml:space="preserve">Wiring table.</w:t>
+      </w:r>
+      <w:r>
+        <w:rPr>
+          <w:rFonts w:ascii="Times New Roman" w:cs="Times New Roman" w:eastAsia="Times New Roman" w:hAnsi="Times New Roman"/>
+          <w:sz w:val="24"/>
+          <w:szCs w:val="24"/>
+        </w:rPr>
+        <w:t xml:space="preserve"> Add one row (slave select, reset, reed switch) for the new compartment to the firmware’s wiring table.</w:t>
+      </w:r>
+    </w:p>
+    <w:p>
+      <w:pPr>
+        <w:pStyle w:val="ListParagraph"/>
+        <w:numPr>
+          <w:ilvl w:val="0"/>
+          <w:numId w:val="2"/>
+        </w:numPr>
+        <w:spacing w:after="60" w:line="336"/>
+        <w:jc w:val="both"/>
+      </w:pPr>
+      <w:r>
+        <w:rPr>
+          <w:rFonts w:ascii="Times New Roman" w:cs="Times New Roman" w:eastAsia="Times New Roman" w:hAnsi="Times New Roman"/>
+          <w:b/>
+          <w:bCs/>
+          <w:sz w:val="24"/>
+          <w:szCs w:val="24"/>
+        </w:rPr>
+        <w:t xml:space="preserve">Compartment count.</w:t>
+      </w:r>
+      <w:r>
+        <w:rPr>
+          <w:rFonts w:ascii="Times New Roman" w:cs="Times New Roman" w:eastAsia="Times New Roman" w:hAnsi="Times New Roman"/>
+          <w:sz w:val="24"/>
+          <w:szCs w:val="24"/>
+        </w:rPr>
+        <w:t xml:space="preserve"> Raise the compartment-count setting in the firmware and the matching constant in the application. A compile-time check stops the firmware build if the table and the count disagree.</w:t>
+      </w:r>
+    </w:p>
+    <w:p>
+      <w:pPr>
+        <w:pStyle w:val="ListParagraph"/>
+        <w:numPr>
+          <w:ilvl w:val="0"/>
+          <w:numId w:val="2"/>
+        </w:numPr>
+        <w:spacing w:after="60" w:line="336"/>
+        <w:jc w:val="both"/>
+      </w:pPr>
+      <w:r>
+        <w:rPr>
+          <w:rFonts w:ascii="Times New Roman" w:cs="Times New Roman" w:eastAsia="Times New Roman" w:hAnsi="Times New Roman"/>
+          <w:b/>
+          <w:bCs/>
+          <w:sz w:val="24"/>
+          <w:szCs w:val="24"/>
+        </w:rPr>
+        <w:t xml:space="preserve">Nothing else.</w:t>
+      </w:r>
+      <w:r>
+        <w:rPr>
+          <w:rFonts w:ascii="Times New Roman" w:cs="Times New Roman" w:eastAsia="Times New Roman" w:hAnsi="Times New Roman"/>
+          <w:sz w:val="24"/>
+          <w:szCs w:val="24"/>
+        </w:rPr>
+        <w:t xml:space="preserve"> The BLE protocol numbers compartments from 1 to N, the command parser accepts any valid compartment number, and the storage layout and the application’s compartment cards are generated from the count.</w:t>
+      </w:r>
+    </w:p>
+    <w:p>
+      <w:pPr>
+        <w:spacing w:after="120" w:line="360"/>
+        <w:jc w:val="both"/>
+      </w:pPr>
+      <w:r>
+        <w:rPr>
+          <w:rFonts w:ascii="Times New Roman" w:cs="Times New Roman" w:eastAsia="Times New Roman" w:hAnsi="Times New Roman"/>
+          <w:sz w:val="24"/>
+          <w:szCs w:val="24"/>
+        </w:rPr>
+        <w:t xml:space="preserve">Two practical limits apply. Each compartment needs three GPIOs (slave select, reset and the reed switch), so the number of compartments is bounded by the free pins of the board; the ESP32’s input-only pins (GPIO 34 to 39) have no internal pull-up and would need an external resistor if used for reed switches. In addition, the readers are polled in turn, so the time between two polls of the same reader grows with the number of compartments (60 ms multiplied by the count in the present firmware). Port expanders or a multiplexer for the slave-select lines would be needed for many compartments. The pin-configuration document describes the two-compartment prototype and is unchanged.</w:t>
       </w:r>
     </w:p>
     <w:p>
@@ -10014,7 +10169,7 @@
           <w:sz w:val="24"/>
           <w:szCs w:val="24"/>
         </w:rPr>
-        <w:t xml:space="preserve"> The firmware polls the two readers alternately every 60 ms, so each reader is polled about every 120 ms and the shared SPI bus is never used by two readers at once.</w:t>
+        <w:t xml:space="preserve"> The firmware polls the readers in turn every 60 ms, so with two compartments each reader is polled about every 120 ms, and the shared SPI bus is never used by two readers at once.</w:t>
       </w:r>
     </w:p>
     <w:p>
@@ -12452,7 +12607,7 @@
           <w:sz w:val="24"/>
           <w:szCs w:val="24"/>
         </w:rPr>
-        <w:t xml:space="preserve">: reed debouncing, reader polling, enrolment mode and command dispatch.</w:t>
+        <w:t xml:space="preserve">: reed debouncing, reader polling, enrolment mode and command dispatch, all driven by a wiring table with one row per compartment.</w:t>
       </w:r>
     </w:p>
     <w:p>
@@ -12593,7 +12748,7 @@
           <w:sz w:val="24"/>
           <w:szCs w:val="24"/>
         </w:rPr>
-        <w:t xml:space="preserve">The bag advertises as “SmartPack” with a custom service, requests a 185-byte MTU, and exchanges one short text line per message. A text protocol was chosen because it is easy to read in a serial monitor and to generate and parse in the app. The service UUID is 6e5a0001-5b1c-4f6e-9a3d-2f7d4c0b5a10; commands are written to the characteristic ending 0002 and events arrive as notifications on the characteristic ending 0003 [3]. Compartments are numbered 1 and 2 on the wire and UIDs are upper-case hexadecimal.</w:t>
+        <w:t xml:space="preserve">The bag advertises as “SmartPack” with a custom service, requests a 185-byte MTU, and exchanges one short text line per message. A text protocol was chosen because it is easy to read in a serial monitor and to generate and parse in the app. The service UUID is 6e5a0001-5b1c-4f6e-9a3d-2f7d4c0b5a10; commands are written to the characteristic ending 0002 and events arrive as notifications on the characteristic ending 0003 [3]. Compartments are numbered 1 to N on the wire (1 and 2 in the prototype) and UIDs are upper-case hexadecimal.</w:t>
       </w:r>
     </w:p>
     <w:p>
@@ -14345,7 +14500,7 @@
           <w:sz w:val="24"/>
           <w:szCs w:val="24"/>
         </w:rPr>
-        <w:t xml:space="preserve">A bag has a fixed number of compartments (two in this prototype). Each compartment has a name and a list of items; each item has a UID, a human-readable name and an inside flag. The bag itself knows only the UIDs and the inside flags. This split means that a lost or stolen bag cannot reveal what its owner carries.</w:t>
+        <w:t xml:space="preserve">A bag has a fixed number of compartments, set by one constant that matches the firmware (two in this prototype). Each compartment has a name and a list of items; each item has a UID, a human-readable name and an inside flag. The bag itself knows only the UIDs and the inside flags. This split means that a lost or stolen bag cannot reveal what its owner carries.</w:t>
       </w:r>
     </w:p>
     <w:p>
@@ -16576,7 +16731,7 @@
           <w:sz w:val="24"/>
           <w:szCs w:val="24"/>
         </w:rPr>
-        <w:t xml:space="preserve">The repository is organised so that each concern lives in one place: the firmware sources and the hardware-independent core logic, a protocol document that both sides follow, the Flutter application, an Arduino IDE copy of the sketch, and the unchanged pin-configuration document. Key limits are set as constants in the firmware: two compartments, sixteen items per compartment, a 60 ms reed debounce, a 60 ms reader polling interval, a 1.5 s same-tag cooldown and a 30 s enrol timeout.</w:t>
+        <w:t xml:space="preserve">The repository is organised so that each concern lives in one place: the firmware sources and the hardware-independent core logic, a protocol document that both sides follow, the Flutter application, an Arduino IDE copy of the sketch, and the unchanged pin-configuration document. Key limits are set as constants in the firmware: the number of compartments (two in the prototype, a build setting), sixteen items per compartment, a 60 ms reed debounce, a 60 ms reader polling interval, a 1.5 s same-tag cooldown and a 30 s enrol timeout.</w:t>
       </w:r>
     </w:p>
     <w:p>
@@ -17182,7 +17337,128 @@
                 <w:sz w:val="19"/>
                 <w:szCs w:val="19"/>
               </w:rPr>
-              <w:t xml:space="preserve">Succeeded: 1,137,279 bytes of program storage (86% of 1,310,720); 44,912 bytes of dynamic memory (13% of 327,680)</w:t>
+              <w:t xml:space="preserve">Succeeded: 1,137,279 bytes of program storage (86% of 1,310,720); 44,912 bytes of dynamic memory (13% of 327,680). Measured before the wiring table was introduced; </w:t>
+            </w:r>
+            <w:r>
+              <w:rPr>
+                <w:rFonts w:ascii="Times New Roman" w:cs="Times New Roman" w:eastAsia="Times New Roman" w:hAnsi="Times New Roman"/>
+                <w:b w:val="false"/>
+                <w:bCs w:val="false"/>
+                <w:sz w:val="19"/>
+                <w:szCs w:val="19"/>
+                <w:highlight w:val="yellow"/>
+              </w:rPr>
+              <w:t xml:space="preserve">re-measure</w:t>
+            </w:r>
+          </w:p>
+        </w:tc>
+      </w:tr>
+      <w:tr>
+        <w:trPr>
+          <w:cantSplit/>
+        </w:trPr>
+        <w:tc>
+          <w:tcPr>
+            <w:tcW w:type="dxa" w:w="2400"/>
+            <w:tcBorders>
+              <w:top w:val="single" w:color="000000" w:sz="4"/>
+              <w:left w:val="single" w:color="000000" w:sz="4"/>
+              <w:bottom w:val="single" w:color="000000" w:sz="4"/>
+              <w:right w:val="single" w:color="000000" w:sz="4"/>
+            </w:tcBorders>
+            <w:tcMar>
+              <w:top w:type="dxa" w:w="50"/>
+              <w:left w:type="dxa" w:w="90"/>
+              <w:bottom w:type="dxa" w:w="50"/>
+              <w:right w:type="dxa" w:w="90"/>
+            </w:tcMar>
+            <w:vAlign w:val="center"/>
+          </w:tcPr>
+          <w:p>
+            <w:pPr>
+              <w:keepNext/>
+              <w:spacing w:after="20" w:line="252"/>
+              <w:jc w:val="left"/>
+            </w:pPr>
+            <w:r>
+              <w:rPr>
+                <w:rFonts w:ascii="Times New Roman" w:cs="Times New Roman" w:eastAsia="Times New Roman" w:hAnsi="Times New Roman"/>
+                <w:b w:val="false"/>
+                <w:bCs w:val="false"/>
+                <w:sz w:val="19"/>
+                <w:szCs w:val="19"/>
+              </w:rPr>
+              <w:t xml:space="preserve">Configurable compartment count</w:t>
+            </w:r>
+          </w:p>
+        </w:tc>
+        <w:tc>
+          <w:tcPr>
+            <w:tcW w:type="dxa" w:w="3406"/>
+            <w:tcBorders>
+              <w:top w:val="single" w:color="000000" w:sz="4"/>
+              <w:left w:val="single" w:color="000000" w:sz="4"/>
+              <w:bottom w:val="single" w:color="000000" w:sz="4"/>
+              <w:right w:val="single" w:color="000000" w:sz="4"/>
+            </w:tcBorders>
+            <w:tcMar>
+              <w:top w:type="dxa" w:w="50"/>
+              <w:left w:type="dxa" w:w="90"/>
+              <w:bottom w:type="dxa" w:w="50"/>
+              <w:right w:type="dxa" w:w="90"/>
+            </w:tcMar>
+            <w:vAlign w:val="center"/>
+          </w:tcPr>
+          <w:p>
+            <w:pPr>
+              <w:keepNext/>
+              <w:spacing w:after="20" w:line="252"/>
+              <w:jc w:val="left"/>
+            </w:pPr>
+            <w:r>
+              <w:rPr>
+                <w:rFonts w:ascii="Times New Roman" w:cs="Times New Roman" w:eastAsia="Times New Roman" w:hAnsi="Times New Roman"/>
+                <w:b w:val="false"/>
+                <w:bCs w:val="false"/>
+                <w:sz w:val="19"/>
+                <w:szCs w:val="19"/>
+              </w:rPr>
+              <w:t xml:space="preserve">Core tests compiled for 2, 3 and 4 compartments; firmware sources type-checked for 2 and 3 compartments (types and syntax only, with stand-in Arduino headers); build stops if the wiring table has the wrong number of rows</w:t>
+            </w:r>
+          </w:p>
+        </w:tc>
+        <w:tc>
+          <w:tcPr>
+            <w:tcW w:type="dxa" w:w="2500"/>
+            <w:tcBorders>
+              <w:top w:val="single" w:color="000000" w:sz="4"/>
+              <w:left w:val="single" w:color="000000" w:sz="4"/>
+              <w:bottom w:val="single" w:color="000000" w:sz="4"/>
+              <w:right w:val="single" w:color="000000" w:sz="4"/>
+            </w:tcBorders>
+            <w:tcMar>
+              <w:top w:type="dxa" w:w="50"/>
+              <w:left w:type="dxa" w:w="90"/>
+              <w:bottom w:type="dxa" w:w="50"/>
+              <w:right w:type="dxa" w:w="90"/>
+            </w:tcMar>
+            <w:vAlign w:val="center"/>
+          </w:tcPr>
+          <w:p>
+            <w:pPr>
+              <w:keepNext/>
+              <w:spacing w:after="20" w:line="252"/>
+              <w:jc w:val="left"/>
+            </w:pPr>
+            <w:r>
+              <w:rPr>
+                <w:rFonts w:ascii="Times New Roman" w:cs="Times New Roman" w:eastAsia="Times New Roman" w:hAnsi="Times New Roman"/>
+                <w:b w:val="false"/>
+                <w:bCs w:val="false"/>
+                <w:sz w:val="19"/>
+                <w:szCs w:val="19"/>
+              </w:rPr>
+              <w:t xml:space="preserve">Passed; not tried on hardware with more than two compartments</w:t>
             </w:r>
           </w:p>
         </w:tc>
@@ -18846,6 +19122,153 @@
                 <w:szCs w:val="18"/>
               </w:rPr>
               <w:t xml:space="preserve">Exactly one IN or OUT event</w:t>
+            </w:r>
+          </w:p>
+        </w:tc>
+        <w:tc>
+          <w:tcPr>
+            <w:tcW w:type="dxa" w:w="1500"/>
+            <w:tcBorders>
+              <w:top w:val="single" w:color="000000" w:sz="4"/>
+              <w:left w:val="single" w:color="000000" w:sz="4"/>
+              <w:bottom w:val="single" w:color="000000" w:sz="4"/>
+              <w:right w:val="single" w:color="000000" w:sz="4"/>
+            </w:tcBorders>
+            <w:tcMar>
+              <w:top w:type="dxa" w:w="50"/>
+              <w:left w:type="dxa" w:w="90"/>
+              <w:bottom w:type="dxa" w:w="50"/>
+              <w:right w:type="dxa" w:w="90"/>
+            </w:tcMar>
+            <w:vAlign w:val="center"/>
+          </w:tcPr>
+          <w:p>
+            <w:pPr>
+              <w:keepNext/>
+              <w:spacing w:after="20" w:line="252"/>
+              <w:jc w:val="left"/>
+            </w:pPr>
+            <w:r>
+              <w:rPr>
+                <w:rFonts w:ascii="Times New Roman" w:cs="Times New Roman" w:eastAsia="Times New Roman" w:hAnsi="Times New Roman"/>
+                <w:b w:val="false"/>
+                <w:bCs w:val="false"/>
+                <w:sz w:val="18"/>
+                <w:szCs w:val="18"/>
+                <w:highlight w:val="yellow"/>
+              </w:rPr>
+              <w:t xml:space="preserve"> </w:t>
+            </w:r>
+          </w:p>
+        </w:tc>
+        <w:tc>
+          <w:tcPr>
+            <w:tcW w:type="dxa" w:w="1400"/>
+            <w:tcBorders>
+              <w:top w:val="single" w:color="000000" w:sz="4"/>
+              <w:left w:val="single" w:color="000000" w:sz="4"/>
+              <w:bottom w:val="single" w:color="000000" w:sz="4"/>
+              <w:right w:val="single" w:color="000000" w:sz="4"/>
+            </w:tcBorders>
+            <w:tcMar>
+              <w:top w:type="dxa" w:w="50"/>
+              <w:left w:type="dxa" w:w="90"/>
+              <w:bottom w:type="dxa" w:w="50"/>
+              <w:right w:type="dxa" w:w="90"/>
+            </w:tcMar>
+            <w:vAlign w:val="center"/>
+          </w:tcPr>
+          <w:p>
+            <w:pPr>
+              <w:keepNext/>
+              <w:spacing w:after="20" w:line="252"/>
+              <w:jc w:val="left"/>
+            </w:pPr>
+            <w:r>
+              <w:rPr>
+                <w:rFonts w:ascii="Times New Roman" w:cs="Times New Roman" w:eastAsia="Times New Roman" w:hAnsi="Times New Roman"/>
+                <w:b w:val="false"/>
+                <w:bCs w:val="false"/>
+                <w:sz w:val="18"/>
+                <w:szCs w:val="18"/>
+                <w:highlight w:val="yellow"/>
+              </w:rPr>
+              <w:t xml:space="preserve"> </w:t>
+            </w:r>
+          </w:p>
+        </w:tc>
+      </w:tr>
+      <w:tr>
+        <w:trPr>
+          <w:cantSplit/>
+        </w:trPr>
+        <w:tc>
+          <w:tcPr>
+            <w:tcW w:type="dxa" w:w="2300"/>
+            <w:tcBorders>
+              <w:top w:val="single" w:color="000000" w:sz="4"/>
+              <w:left w:val="single" w:color="000000" w:sz="4"/>
+              <w:bottom w:val="single" w:color="000000" w:sz="4"/>
+              <w:right w:val="single" w:color="000000" w:sz="4"/>
+            </w:tcBorders>
+            <w:tcMar>
+              <w:top w:type="dxa" w:w="50"/>
+              <w:left w:type="dxa" w:w="90"/>
+              <w:bottom w:type="dxa" w:w="50"/>
+              <w:right w:type="dxa" w:w="90"/>
+            </w:tcMar>
+            <w:vAlign w:val="center"/>
+          </w:tcPr>
+          <w:p>
+            <w:pPr>
+              <w:keepNext/>
+              <w:spacing w:after="20" w:line="252"/>
+              <w:jc w:val="left"/>
+            </w:pPr>
+            <w:r>
+              <w:rPr>
+                <w:rFonts w:ascii="Times New Roman" w:cs="Times New Roman" w:eastAsia="Times New Roman" w:hAnsi="Times New Roman"/>
+                <w:b w:val="false"/>
+                <w:bCs w:val="false"/>
+                <w:sz w:val="18"/>
+                <w:szCs w:val="18"/>
+              </w:rPr>
+              <w:t xml:space="preserve">Tag presented to one reader with another compartment’s reader nearby</w:t>
+            </w:r>
+          </w:p>
+        </w:tc>
+        <w:tc>
+          <w:tcPr>
+            <w:tcW w:type="dxa" w:w="3106"/>
+            <w:tcBorders>
+              <w:top w:val="single" w:color="000000" w:sz="4"/>
+              <w:left w:val="single" w:color="000000" w:sz="4"/>
+              <w:bottom w:val="single" w:color="000000" w:sz="4"/>
+              <w:right w:val="single" w:color="000000" w:sz="4"/>
+            </w:tcBorders>
+            <w:tcMar>
+              <w:top w:type="dxa" w:w="50"/>
+              <w:left w:type="dxa" w:w="90"/>
+              <w:bottom w:type="dxa" w:w="50"/>
+              <w:right w:type="dxa" w:w="90"/>
+            </w:tcMar>
+            <w:vAlign w:val="center"/>
+          </w:tcPr>
+          <w:p>
+            <w:pPr>
+              <w:keepNext/>
+              <w:spacing w:after="20" w:line="252"/>
+              <w:jc w:val="left"/>
+            </w:pPr>
+            <w:r>
+              <w:rPr>
+                <w:rFonts w:ascii="Times New Roman" w:cs="Times New Roman" w:eastAsia="Times New Roman" w:hAnsi="Times New Roman"/>
+                <w:b w:val="false"/>
+                <w:bCs w:val="false"/>
+                <w:sz w:val="18"/>
+                <w:szCs w:val="18"/>
+              </w:rPr>
+              <w:t xml:space="preserve">Only the intended reader reports the tag (no cross-read)</w:t>
             </w:r>
           </w:p>
         </w:tc>
@@ -21416,7 +21839,7 @@
         <w:rPr>
           <w:rFonts w:ascii="Times New Roman" w:cs="Times New Roman" w:eastAsia="Times New Roman" w:hAnsi="Times New Roman"/>
         </w:rPr>
-        <w:t xml:space="preserve">5.3.6 Application behaviour</w:t>
+        <w:t xml:space="preserve">5.3.6 Number of compartments</w:t>
       </w:r>
     </w:p>
     <w:p>
@@ -21430,6 +21853,31 @@
           <w:sz w:val="24"/>
           <w:szCs w:val="24"/>
         </w:rPr>
+        <w:t xml:space="preserve">The prototype was built with two compartments. Because the compartment count is a build setting and the compartments are independent in the logic, the same firmware and application should extend to more compartments by following Section 3.2.4, and the core logic tests pass when compiled for two, three and four compartments. The hardware effects of more readers have not been measured: loading of the shared SPI bus, current draw, the longer polling interval of each reader and, above all, whether the antennas of neighbouring readers read each other’s tags when the compartments are close together. If cross-reads occur, the readers need separation or shielding; the trial plan therefore includes a cross-read test.</w:t>
+      </w:r>
+    </w:p>
+    <w:p>
+      <w:pPr>
+        <w:pStyle w:val="Heading3"/>
+      </w:pPr>
+      <w:r>
+        <w:rPr>
+          <w:rFonts w:ascii="Times New Roman" w:cs="Times New Roman" w:eastAsia="Times New Roman" w:hAnsi="Times New Roman"/>
+        </w:rPr>
+        <w:t xml:space="preserve">5.3.7 Application behaviour</w:t>
+      </w:r>
+    </w:p>
+    <w:p>
+      <w:pPr>
+        <w:spacing w:after="120" w:line="360"/>
+        <w:jc w:val="both"/>
+      </w:pPr>
+      <w:r>
+        <w:rPr>
+          <w:rFonts w:ascii="Times New Roman" w:cs="Times New Roman" w:eastAsia="Times New Roman" w:hAnsi="Times New Roman"/>
+          <w:sz w:val="24"/>
+          <w:szCs w:val="24"/>
+        </w:rPr>
         <w:t xml:space="preserve">Missing-item alerts are shown by the application while it is running and connected. Alerts when the application is in the background, and automatic reconnection when the phone comes back into range, have not yet been implemented.</w:t>
       </w:r>
     </w:p>
@@ -21474,7 +21922,7 @@
           <w:sz w:val="24"/>
           <w:szCs w:val="24"/>
         </w:rPr>
-        <w:t xml:space="preserve">This project designed and implemented SmartPack, a smart bag that verifies its contents at the moment a compartment is closed. Each compartment has its own RFID reader and reed switch, an RFID scan is treated as one crossing of the compartment’s opening so that every item toggles between inside and outside, and closing the compartment triggers a check that every assigned item is inside. A missing item produces an immediate local alert and a Bluetooth message that the Flutter application turns into a notice naming the item. Item names stay on the phone, and new items are added by naming them and tapping their tag on the reader.</w:t>
+        <w:t xml:space="preserve">This project designed and implemented SmartPack, a smart bag that verifies its contents at the moment a compartment is closed. Each compartment has its own RFID reader and reed switch (two in the prototype, extendable through a wiring-table row and a build setting), an RFID scan is treated as one crossing of the compartment’s opening so that every item toggles between inside and outside, and closing the compartment triggers a check that every assigned item is inside. A missing item produces an immediate local alert and a Bluetooth message that the Flutter application turns into a notice naming the item. Item names stay on the phone, and new items are added by naming them and tapping their tag on the reader.</w:t>
       </w:r>
     </w:p>
     <w:p>
@@ -21644,7 +22092,7 @@
           <w:sz w:val="24"/>
           <w:szCs w:val="24"/>
         </w:rPr>
-        <w:t xml:space="preserve">: more readers per bag, several bags per application, and assigning the same item to different bags.</w:t>
+        <w:t xml:space="preserve">: hardware trials with more than two compartments, port expanders for many compartments, runtime discovery of the compartment count by the application, several bags per application, and assigning the same item to different bags.</w:t>
       </w:r>
     </w:p>
     <w:p>

</xml_diff>

<commit_message>
Report: enlarge and sharpen the app screenshot (Figure 20)
Co-Authored-By: Claude Sonnet 5.5 <noreply@anthropic.com>
Claude-Session: https://claude.ai/code/session_01Sscac89Z6gGAA6gjTxH9m6
</commit_message>
<xml_diff>
--- a/docs/report/SmartPack_Project_Report.docx
+++ b/docs/report/SmartPack_Project_Report.docx
@@ -30520,7 +30520,7 @@
       <w:r>
         <w:drawing>
           <wp:inline distT="0" distB="0" distL="0" distR="0">
-            <wp:extent cx="2381250" cy="5295900"/>
+            <wp:extent cx="2857500" cy="4962525"/>
             <wp:effectExtent t="0" r="0" b="0" l="0"/>
             <wp:docPr id="1" name="appshot" descr="Screen of the SmartPack mobile application" title="Figure: Screen of the SmartPack mobile application"/>
             <wp:cNvGraphicFramePr>
@@ -30545,7 +30545,7 @@
                   <pic:spPr bwMode="auto">
                     <a:xfrm>
                       <a:off x="0" y="0"/>
-                      <a:ext cx="2381250" cy="5295900"/>
+                      <a:ext cx="2857500" cy="4962525"/>
                     </a:xfrm>
                     <a:prstGeom prst="rect">
                       <a:avLst/>

</xml_diff>

<commit_message>
Report: remove forced page breaks and shrink UML figures to cut blank space (61 -> 54 pages)
Co-Authored-By: Claude Sonnet 5.5 <noreply@anthropic.com>
Claude-Session: https://claude.ai/code/session_01Sscac89Z6gGAA6gjTxH9m6
</commit_message>
<xml_diff>
--- a/docs/report/SmartPack_Project_Report.docx
+++ b/docs/report/SmartPack_Project_Report.docx
@@ -1344,7 +1344,7 @@
               <w:sz w:val="24"/>
               <w:szCs w:val="24"/>
             </w:rPr>
-            <w:t>13</w:t>
+            <w:t>12</w:t>
           </w:r>
         </w:p>
         <w:p>
@@ -1380,7 +1380,7 @@
               <w:sz w:val="24"/>
               <w:szCs w:val="24"/>
             </w:rPr>
-            <w:t>13</w:t>
+            <w:t>12</w:t>
           </w:r>
         </w:p>
         <w:p>
@@ -1416,7 +1416,7 @@
               <w:sz w:val="24"/>
               <w:szCs w:val="24"/>
             </w:rPr>
-            <w:t>13</w:t>
+            <w:t>12</w:t>
           </w:r>
         </w:p>
         <w:p>
@@ -1488,7 +1488,7 @@
               <w:sz w:val="24"/>
               <w:szCs w:val="24"/>
             </w:rPr>
-            <w:t>14</w:t>
+            <w:t>13</w:t>
           </w:r>
         </w:p>
         <w:p>
@@ -1524,7 +1524,7 @@
               <w:sz w:val="24"/>
               <w:szCs w:val="24"/>
             </w:rPr>
-            <w:t>14</w:t>
+            <w:t>13</w:t>
           </w:r>
         </w:p>
         <w:p>
@@ -1560,7 +1560,7 @@
               <w:sz w:val="24"/>
               <w:szCs w:val="24"/>
             </w:rPr>
-            <w:t>14</w:t>
+            <w:t>13</w:t>
           </w:r>
         </w:p>
         <w:p>
@@ -1596,7 +1596,7 @@
               <w:sz w:val="24"/>
               <w:szCs w:val="24"/>
             </w:rPr>
-            <w:t>14</w:t>
+            <w:t>13</w:t>
           </w:r>
         </w:p>
         <w:p>
@@ -1632,7 +1632,7 @@
               <w:sz w:val="24"/>
               <w:szCs w:val="24"/>
             </w:rPr>
-            <w:t>14</w:t>
+            <w:t>13</w:t>
           </w:r>
         </w:p>
         <w:p>
@@ -1674,7 +1674,7 @@
               <w:sz w:val="24"/>
               <w:szCs w:val="24"/>
             </w:rPr>
-            <w:t>15</w:t>
+            <w:t>14</w:t>
           </w:r>
         </w:p>
         <w:p>
@@ -1710,7 +1710,7 @@
               <w:sz w:val="24"/>
               <w:szCs w:val="24"/>
             </w:rPr>
-            <w:t>15</w:t>
+            <w:t>14</w:t>
           </w:r>
         </w:p>
         <w:p>
@@ -1746,7 +1746,7 @@
               <w:sz w:val="24"/>
               <w:szCs w:val="24"/>
             </w:rPr>
-            <w:t>15</w:t>
+            <w:t>14</w:t>
           </w:r>
         </w:p>
         <w:p>
@@ -1782,7 +1782,7 @@
               <w:sz w:val="24"/>
               <w:szCs w:val="24"/>
             </w:rPr>
-            <w:t>15</w:t>
+            <w:t>14</w:t>
           </w:r>
         </w:p>
         <w:p>
@@ -1818,7 +1818,7 @@
               <w:sz w:val="24"/>
               <w:szCs w:val="24"/>
             </w:rPr>
-            <w:t>15</w:t>
+            <w:t>14</w:t>
           </w:r>
         </w:p>
         <w:p>
@@ -1854,7 +1854,7 @@
               <w:sz w:val="24"/>
               <w:szCs w:val="24"/>
             </w:rPr>
-            <w:t>15</w:t>
+            <w:t>14</w:t>
           </w:r>
         </w:p>
         <w:p>
@@ -1890,7 +1890,7 @@
               <w:sz w:val="24"/>
               <w:szCs w:val="24"/>
             </w:rPr>
-            <w:t>15</w:t>
+            <w:t>14</w:t>
           </w:r>
         </w:p>
         <w:p>
@@ -1926,7 +1926,7 @@
               <w:sz w:val="24"/>
               <w:szCs w:val="24"/>
             </w:rPr>
-            <w:t>15</w:t>
+            <w:t>14</w:t>
           </w:r>
         </w:p>
         <w:p>
@@ -1962,7 +1962,7 @@
               <w:sz w:val="24"/>
               <w:szCs w:val="24"/>
             </w:rPr>
-            <w:t>16</w:t>
+            <w:t>15</w:t>
           </w:r>
         </w:p>
         <w:p>
@@ -1998,7 +1998,7 @@
               <w:sz w:val="24"/>
               <w:szCs w:val="24"/>
             </w:rPr>
-            <w:t>16</w:t>
+            <w:t>15</w:t>
           </w:r>
         </w:p>
         <w:p>
@@ -2040,7 +2040,7 @@
               <w:sz w:val="24"/>
               <w:szCs w:val="24"/>
             </w:rPr>
-            <w:t>17</w:t>
+            <w:t>15</w:t>
           </w:r>
         </w:p>
         <w:p>
@@ -2076,7 +2076,7 @@
               <w:sz w:val="24"/>
               <w:szCs w:val="24"/>
             </w:rPr>
-            <w:t>17</w:t>
+            <w:t>15</w:t>
           </w:r>
         </w:p>
         <w:p>
@@ -2112,7 +2112,7 @@
               <w:sz w:val="24"/>
               <w:szCs w:val="24"/>
             </w:rPr>
-            <w:t>18</w:t>
+            <w:t>16</w:t>
           </w:r>
         </w:p>
         <w:p>
@@ -2148,7 +2148,7 @@
               <w:sz w:val="24"/>
               <w:szCs w:val="24"/>
             </w:rPr>
-            <w:t>18</w:t>
+            <w:t>17</w:t>
           </w:r>
         </w:p>
         <w:p>
@@ -2184,7 +2184,7 @@
               <w:sz w:val="24"/>
               <w:szCs w:val="24"/>
             </w:rPr>
-            <w:t>19</w:t>
+            <w:t>17</w:t>
           </w:r>
         </w:p>
         <w:p>
@@ -2220,7 +2220,7 @@
               <w:sz w:val="24"/>
               <w:szCs w:val="24"/>
             </w:rPr>
-            <w:t>20</w:t>
+            <w:t>18</w:t>
           </w:r>
         </w:p>
         <w:p>
@@ -2256,7 +2256,7 @@
               <w:sz w:val="24"/>
               <w:szCs w:val="24"/>
             </w:rPr>
-            <w:t>21</w:t>
+            <w:t>19</w:t>
           </w:r>
         </w:p>
         <w:p>
@@ -2292,7 +2292,7 @@
               <w:sz w:val="24"/>
               <w:szCs w:val="24"/>
             </w:rPr>
-            <w:t>22</w:t>
+            <w:t>19</w:t>
           </w:r>
         </w:p>
         <w:p>
@@ -2328,7 +2328,7 @@
               <w:sz w:val="24"/>
               <w:szCs w:val="24"/>
             </w:rPr>
-            <w:t>23</w:t>
+            <w:t>20</w:t>
           </w:r>
         </w:p>
         <w:p>
@@ -2364,7 +2364,7 @@
               <w:sz w:val="24"/>
               <w:szCs w:val="24"/>
             </w:rPr>
-            <w:t>24</w:t>
+            <w:t>20</w:t>
           </w:r>
         </w:p>
         <w:p>
@@ -2406,7 +2406,7 @@
               <w:sz w:val="24"/>
               <w:szCs w:val="24"/>
             </w:rPr>
-            <w:t>25</w:t>
+            <w:t>21</w:t>
           </w:r>
         </w:p>
         <w:p>
@@ -2442,7 +2442,7 @@
               <w:sz w:val="24"/>
               <w:szCs w:val="24"/>
             </w:rPr>
-            <w:t>25</w:t>
+            <w:t>21</w:t>
           </w:r>
         </w:p>
         <w:p>
@@ -2478,7 +2478,7 @@
               <w:sz w:val="24"/>
               <w:szCs w:val="24"/>
             </w:rPr>
-            <w:t>25</w:t>
+            <w:t>21</w:t>
           </w:r>
         </w:p>
         <w:p>
@@ -2514,7 +2514,7 @@
               <w:sz w:val="24"/>
               <w:szCs w:val="24"/>
             </w:rPr>
-            <w:t>26</w:t>
+            <w:t>22</w:t>
           </w:r>
         </w:p>
         <w:p>
@@ -2550,7 +2550,7 @@
               <w:sz w:val="24"/>
               <w:szCs w:val="24"/>
             </w:rPr>
-            <w:t>27</w:t>
+            <w:t>23</w:t>
           </w:r>
         </w:p>
         <w:p>
@@ -2592,7 +2592,7 @@
               <w:sz w:val="24"/>
               <w:szCs w:val="24"/>
             </w:rPr>
-            <w:t>28</w:t>
+            <w:t>23</w:t>
           </w:r>
         </w:p>
         <w:p>
@@ -2628,7 +2628,7 @@
               <w:sz w:val="24"/>
               <w:szCs w:val="24"/>
             </w:rPr>
-            <w:t>28</w:t>
+            <w:t>23</w:t>
           </w:r>
         </w:p>
         <w:p>
@@ -2664,7 +2664,7 @@
               <w:sz w:val="24"/>
               <w:szCs w:val="24"/>
             </w:rPr>
-            <w:t>29</w:t>
+            <w:t>24</w:t>
           </w:r>
         </w:p>
         <w:p>
@@ -2700,7 +2700,7 @@
               <w:sz w:val="24"/>
               <w:szCs w:val="24"/>
             </w:rPr>
-            <w:t>30</w:t>
+            <w:t>25</w:t>
           </w:r>
         </w:p>
         <w:p>
@@ -2736,7 +2736,7 @@
               <w:sz w:val="24"/>
               <w:szCs w:val="24"/>
             </w:rPr>
-            <w:t>31</w:t>
+            <w:t>26</w:t>
           </w:r>
         </w:p>
         <w:p>
@@ -2772,7 +2772,7 @@
               <w:sz w:val="24"/>
               <w:szCs w:val="24"/>
             </w:rPr>
-            <w:t>32</w:t>
+            <w:t>27</w:t>
           </w:r>
         </w:p>
         <w:p>
@@ -2808,7 +2808,7 @@
               <w:sz w:val="24"/>
               <w:szCs w:val="24"/>
             </w:rPr>
-            <w:t>33</w:t>
+            <w:t>28</w:t>
           </w:r>
         </w:p>
         <w:p>
@@ -2850,7 +2850,7 @@
               <w:sz w:val="24"/>
               <w:szCs w:val="24"/>
             </w:rPr>
-            <w:t>34</w:t>
+            <w:t>28</w:t>
           </w:r>
         </w:p>
         <w:p>
@@ -2886,7 +2886,7 @@
               <w:sz w:val="24"/>
               <w:szCs w:val="24"/>
             </w:rPr>
-            <w:t>34</w:t>
+            <w:t>28</w:t>
           </w:r>
         </w:p>
         <w:p>
@@ -2922,7 +2922,7 @@
               <w:sz w:val="24"/>
               <w:szCs w:val="24"/>
             </w:rPr>
-            <w:t>34</w:t>
+            <w:t>29</w:t>
           </w:r>
         </w:p>
         <w:p>
@@ -2958,7 +2958,7 @@
               <w:sz w:val="24"/>
               <w:szCs w:val="24"/>
             </w:rPr>
-            <w:t>35</w:t>
+            <w:t>30</w:t>
           </w:r>
         </w:p>
         <w:p>
@@ -2994,7 +2994,7 @@
               <w:sz w:val="24"/>
               <w:szCs w:val="24"/>
             </w:rPr>
-            <w:t>36</w:t>
+            <w:t>31</w:t>
           </w:r>
         </w:p>
         <w:p>
@@ -3030,7 +3030,7 @@
               <w:sz w:val="24"/>
               <w:szCs w:val="24"/>
             </w:rPr>
-            <w:t>36</w:t>
+            <w:t>31</w:t>
           </w:r>
         </w:p>
         <w:p>
@@ -3066,7 +3066,7 @@
               <w:sz w:val="24"/>
               <w:szCs w:val="24"/>
             </w:rPr>
-            <w:t>36</w:t>
+            <w:t>31</w:t>
           </w:r>
         </w:p>
         <w:p>
@@ -3102,7 +3102,7 @@
               <w:sz w:val="24"/>
               <w:szCs w:val="24"/>
             </w:rPr>
-            <w:t>39</w:t>
+            <w:t>34</w:t>
           </w:r>
         </w:p>
         <w:p>
@@ -3144,7 +3144,7 @@
               <w:sz w:val="24"/>
               <w:szCs w:val="24"/>
             </w:rPr>
-            <w:t>40</w:t>
+            <w:t>35</w:t>
           </w:r>
         </w:p>
         <w:p>
@@ -3180,7 +3180,7 @@
               <w:sz w:val="24"/>
               <w:szCs w:val="24"/>
             </w:rPr>
-            <w:t>40</w:t>
+            <w:t>35</w:t>
           </w:r>
         </w:p>
         <w:p>
@@ -3216,7 +3216,7 @@
               <w:sz w:val="24"/>
               <w:szCs w:val="24"/>
             </w:rPr>
-            <w:t>40</w:t>
+            <w:t>35</w:t>
           </w:r>
         </w:p>
         <w:p>
@@ -3252,7 +3252,7 @@
               <w:sz w:val="24"/>
               <w:szCs w:val="24"/>
             </w:rPr>
-            <w:t>41</w:t>
+            <w:t>36</w:t>
           </w:r>
         </w:p>
         <w:p>
@@ -3288,7 +3288,7 @@
               <w:sz w:val="24"/>
               <w:szCs w:val="24"/>
             </w:rPr>
-            <w:t>42</w:t>
+            <w:t>37</w:t>
           </w:r>
         </w:p>
         <w:p>
@@ -3324,7 +3324,7 @@
               <w:sz w:val="24"/>
               <w:szCs w:val="24"/>
             </w:rPr>
-            <w:t>44</w:t>
+            <w:t>39</w:t>
           </w:r>
         </w:p>
         <w:p>
@@ -3366,7 +3366,7 @@
               <w:sz w:val="24"/>
               <w:szCs w:val="24"/>
             </w:rPr>
-            <w:t>45</w:t>
+            <w:t>39</w:t>
           </w:r>
         </w:p>
         <w:p>
@@ -3402,7 +3402,7 @@
               <w:sz w:val="24"/>
               <w:szCs w:val="24"/>
             </w:rPr>
-            <w:t>45</w:t>
+            <w:t>39</w:t>
           </w:r>
         </w:p>
         <w:p>
@@ -3438,7 +3438,7 @@
               <w:sz w:val="24"/>
               <w:szCs w:val="24"/>
             </w:rPr>
-            <w:t>45</w:t>
+            <w:t>39</w:t>
           </w:r>
         </w:p>
         <w:p>
@@ -3474,7 +3474,7 @@
               <w:sz w:val="24"/>
               <w:szCs w:val="24"/>
             </w:rPr>
-            <w:t>45</w:t>
+            <w:t>40</w:t>
           </w:r>
         </w:p>
         <w:p>
@@ -3510,7 +3510,7 @@
               <w:sz w:val="24"/>
               <w:szCs w:val="24"/>
             </w:rPr>
-            <w:t>46</w:t>
+            <w:t>40</w:t>
           </w:r>
         </w:p>
         <w:p>
@@ -3552,7 +3552,7 @@
               <w:sz w:val="24"/>
               <w:szCs w:val="24"/>
             </w:rPr>
-            <w:t>47</w:t>
+            <w:t>40</w:t>
           </w:r>
         </w:p>
         <w:p>
@@ -3588,7 +3588,7 @@
               <w:sz w:val="24"/>
               <w:szCs w:val="24"/>
             </w:rPr>
-            <w:t>47</w:t>
+            <w:t>40</w:t>
           </w:r>
         </w:p>
         <w:p>
@@ -3624,7 +3624,7 @@
               <w:sz w:val="24"/>
               <w:szCs w:val="24"/>
             </w:rPr>
-            <w:t>47</w:t>
+            <w:t>40</w:t>
           </w:r>
         </w:p>
         <w:p>
@@ -3660,7 +3660,7 @@
               <w:sz w:val="24"/>
               <w:szCs w:val="24"/>
             </w:rPr>
-            <w:t>47</w:t>
+            <w:t>41</w:t>
           </w:r>
         </w:p>
         <w:p>
@@ -3702,7 +3702,7 @@
               <w:sz w:val="24"/>
               <w:szCs w:val="24"/>
             </w:rPr>
-            <w:t>49</w:t>
+            <w:t>42</w:t>
           </w:r>
         </w:p>
         <w:p>
@@ -3738,7 +3738,7 @@
               <w:sz w:val="24"/>
               <w:szCs w:val="24"/>
             </w:rPr>
-            <w:t>49</w:t>
+            <w:t>42</w:t>
           </w:r>
         </w:p>
         <w:p>
@@ -3774,7 +3774,7 @@
               <w:sz w:val="24"/>
               <w:szCs w:val="24"/>
             </w:rPr>
-            <w:t>49</w:t>
+            <w:t>43</w:t>
           </w:r>
         </w:p>
         <w:p>
@@ -3810,7 +3810,7 @@
               <w:sz w:val="24"/>
               <w:szCs w:val="24"/>
             </w:rPr>
-            <w:t>50</w:t>
+            <w:t>43</w:t>
           </w:r>
         </w:p>
         <w:p>
@@ -3846,7 +3846,7 @@
               <w:sz w:val="24"/>
               <w:szCs w:val="24"/>
             </w:rPr>
-            <w:t>50</w:t>
+            <w:t>43</w:t>
           </w:r>
         </w:p>
         <w:p>
@@ -3882,7 +3882,7 @@
               <w:sz w:val="24"/>
               <w:szCs w:val="24"/>
             </w:rPr>
-            <w:t>50</w:t>
+            <w:t>44</w:t>
           </w:r>
         </w:p>
         <w:p>
@@ -3918,7 +3918,7 @@
               <w:sz w:val="24"/>
               <w:szCs w:val="24"/>
             </w:rPr>
-            <w:t>51</w:t>
+            <w:t>44</w:t>
           </w:r>
         </w:p>
         <w:p>
@@ -3960,7 +3960,7 @@
               <w:sz w:val="24"/>
               <w:szCs w:val="24"/>
             </w:rPr>
-            <w:t>52</w:t>
+            <w:t>44</w:t>
           </w:r>
         </w:p>
         <w:p>
@@ -4032,7 +4032,7 @@
               <w:sz w:val="24"/>
               <w:szCs w:val="24"/>
             </w:rPr>
-            <w:t>17</w:t>
+            <w:t>16</w:t>
           </w:r>
         </w:p>
         <w:p>
@@ -4068,7 +4068,7 @@
               <w:sz w:val="24"/>
               <w:szCs w:val="24"/>
             </w:rPr>
-            <w:t>18</w:t>
+            <w:t>16</w:t>
           </w:r>
         </w:p>
         <w:p>
@@ -4104,7 +4104,7 @@
               <w:sz w:val="24"/>
               <w:szCs w:val="24"/>
             </w:rPr>
-            <w:t>19</w:t>
+            <w:t>17</w:t>
           </w:r>
         </w:p>
         <w:p>
@@ -4140,7 +4140,7 @@
               <w:sz w:val="24"/>
               <w:szCs w:val="24"/>
             </w:rPr>
-            <w:t>20</w:t>
+            <w:t>18</w:t>
           </w:r>
         </w:p>
         <w:p>
@@ -4176,7 +4176,7 @@
               <w:sz w:val="24"/>
               <w:szCs w:val="24"/>
             </w:rPr>
-            <w:t>21</w:t>
+            <w:t>18</w:t>
           </w:r>
         </w:p>
         <w:p>
@@ -4212,7 +4212,7 @@
               <w:sz w:val="24"/>
               <w:szCs w:val="24"/>
             </w:rPr>
-            <w:t>22</w:t>
+            <w:t>19</w:t>
           </w:r>
         </w:p>
         <w:p>
@@ -4248,7 +4248,7 @@
               <w:sz w:val="24"/>
               <w:szCs w:val="24"/>
             </w:rPr>
-            <w:t>23</w:t>
+            <w:t>19</w:t>
           </w:r>
         </w:p>
         <w:p>
@@ -4284,7 +4284,7 @@
               <w:sz w:val="24"/>
               <w:szCs w:val="24"/>
             </w:rPr>
-            <w:t>24</w:t>
+            <w:t>20</w:t>
           </w:r>
         </w:p>
         <w:p>
@@ -4320,7 +4320,7 @@
               <w:sz w:val="24"/>
               <w:szCs w:val="24"/>
             </w:rPr>
-            <w:t>25</w:t>
+            <w:t>21</w:t>
           </w:r>
         </w:p>
         <w:p>
@@ -4356,7 +4356,7 @@
               <w:sz w:val="24"/>
               <w:szCs w:val="24"/>
             </w:rPr>
-            <w:t>26</w:t>
+            <w:t>22</w:t>
           </w:r>
         </w:p>
         <w:p>
@@ -4392,7 +4392,7 @@
               <w:sz w:val="24"/>
               <w:szCs w:val="24"/>
             </w:rPr>
-            <w:t>29</w:t>
+            <w:t>24</w:t>
           </w:r>
         </w:p>
         <w:p>
@@ -4428,7 +4428,7 @@
               <w:sz w:val="24"/>
               <w:szCs w:val="24"/>
             </w:rPr>
-            <w:t>30</w:t>
+            <w:t>25</w:t>
           </w:r>
         </w:p>
         <w:p>
@@ -4464,7 +4464,7 @@
               <w:sz w:val="24"/>
               <w:szCs w:val="24"/>
             </w:rPr>
-            <w:t>31</w:t>
+            <w:t>26</w:t>
           </w:r>
         </w:p>
         <w:p>
@@ -4500,7 +4500,7 @@
               <w:sz w:val="24"/>
               <w:szCs w:val="24"/>
             </w:rPr>
-            <w:t>32</w:t>
+            <w:t>27</w:t>
           </w:r>
         </w:p>
         <w:p>
@@ -4536,7 +4536,7 @@
               <w:sz w:val="24"/>
               <w:szCs w:val="24"/>
             </w:rPr>
-            <w:t>35</w:t>
+            <w:t>30</w:t>
           </w:r>
         </w:p>
         <w:p>
@@ -4572,7 +4572,7 @@
               <w:sz w:val="24"/>
               <w:szCs w:val="24"/>
             </w:rPr>
-            <w:t>37</w:t>
+            <w:t>32</w:t>
           </w:r>
         </w:p>
         <w:p>
@@ -4608,7 +4608,7 @@
               <w:sz w:val="24"/>
               <w:szCs w:val="24"/>
             </w:rPr>
-            <w:t>38</w:t>
+            <w:t>33</w:t>
           </w:r>
         </w:p>
         <w:p>
@@ -4644,7 +4644,7 @@
               <w:sz w:val="24"/>
               <w:szCs w:val="24"/>
             </w:rPr>
-            <w:t>38</w:t>
+            <w:t>33</w:t>
           </w:r>
         </w:p>
         <w:p>
@@ -4680,7 +4680,7 @@
               <w:sz w:val="24"/>
               <w:szCs w:val="24"/>
             </w:rPr>
-            <w:t>39</w:t>
+            <w:t>34</w:t>
           </w:r>
         </w:p>
         <w:p>
@@ -4716,7 +4716,7 @@
               <w:sz w:val="24"/>
               <w:szCs w:val="24"/>
             </w:rPr>
-            <w:t>43</w:t>
+            <w:t>38</w:t>
           </w:r>
         </w:p>
         <w:p>
@@ -4932,7 +4932,7 @@
               <w:sz w:val="24"/>
               <w:szCs w:val="24"/>
             </w:rPr>
-            <w:t>13</w:t>
+            <w:t>12</w:t>
           </w:r>
         </w:p>
         <w:p>
@@ -4968,7 +4968,7 @@
               <w:sz w:val="24"/>
               <w:szCs w:val="24"/>
             </w:rPr>
-            <w:t>24</w:t>
+            <w:t>20</w:t>
           </w:r>
         </w:p>
         <w:p>
@@ -5004,7 +5004,7 @@
               <w:sz w:val="24"/>
               <w:szCs w:val="24"/>
             </w:rPr>
-            <w:t>26</w:t>
+            <w:t>22</w:t>
           </w:r>
         </w:p>
         <w:p>
@@ -5040,7 +5040,7 @@
               <w:sz w:val="24"/>
               <w:szCs w:val="24"/>
             </w:rPr>
-            <w:t>27</w:t>
+            <w:t>23</w:t>
           </w:r>
         </w:p>
         <w:p>
@@ -5076,7 +5076,7 @@
               <w:sz w:val="24"/>
               <w:szCs w:val="24"/>
             </w:rPr>
-            <w:t>33</w:t>
+            <w:t>28</w:t>
           </w:r>
         </w:p>
         <w:p>
@@ -5112,7 +5112,7 @@
               <w:sz w:val="24"/>
               <w:szCs w:val="24"/>
             </w:rPr>
-            <w:t>34</w:t>
+            <w:t>29</w:t>
           </w:r>
         </w:p>
         <w:p>
@@ -5148,7 +5148,7 @@
               <w:sz w:val="24"/>
               <w:szCs w:val="24"/>
             </w:rPr>
-            <w:t>35</w:t>
+            <w:t>30</w:t>
           </w:r>
         </w:p>
         <w:p>
@@ -5184,7 +5184,7 @@
               <w:sz w:val="24"/>
               <w:szCs w:val="24"/>
             </w:rPr>
-            <w:t>40</w:t>
+            <w:t>35</w:t>
           </w:r>
         </w:p>
         <w:p>
@@ -5220,7 +5220,7 @@
               <w:sz w:val="24"/>
               <w:szCs w:val="24"/>
             </w:rPr>
-            <w:t>41</w:t>
+            <w:t>36</w:t>
           </w:r>
         </w:p>
         <w:p>
@@ -5256,7 +5256,7 @@
               <w:sz w:val="24"/>
               <w:szCs w:val="24"/>
             </w:rPr>
-            <w:t>41</w:t>
+            <w:t>36</w:t>
           </w:r>
         </w:p>
         <w:p>
@@ -5292,7 +5292,7 @@
               <w:sz w:val="24"/>
               <w:szCs w:val="24"/>
             </w:rPr>
-            <w:t>41</w:t>
+            <w:t>36</w:t>
           </w:r>
         </w:p>
         <w:p>
@@ -5328,7 +5328,7 @@
               <w:sz w:val="24"/>
               <w:szCs w:val="24"/>
             </w:rPr>
-            <w:t>44</w:t>
+            <w:t>39</w:t>
           </w:r>
         </w:p>
         <w:p>
@@ -5364,7 +5364,7 @@
               <w:sz w:val="24"/>
               <w:szCs w:val="24"/>
             </w:rPr>
-            <w:t>45</w:t>
+            <w:t>39</w:t>
           </w:r>
         </w:p>
         <w:p>
@@ -5400,7 +5400,7 @@
               <w:sz w:val="24"/>
               <w:szCs w:val="24"/>
             </w:rPr>
-            <w:t>47</w:t>
+            <w:t>41</w:t>
           </w:r>
         </w:p>
         <w:p>
@@ -5436,7 +5436,7 @@
               <w:sz w:val="24"/>
               <w:szCs w:val="24"/>
             </w:rPr>
-            <w:t>49</w:t>
+            <w:t>42</w:t>
           </w:r>
         </w:p>
         <w:p>
@@ -6099,7 +6099,7 @@
     <w:p>
       <w:pPr>
         <w:pStyle w:val="Heading1"/>
-        <w:pageBreakBefore/>
+        <w:spacing w:after="300" w:before="360"/>
       </w:pPr>
       <w:r>
         <w:rPr>
@@ -8436,7 +8436,7 @@
     <w:p>
       <w:pPr>
         <w:pStyle w:val="Heading1"/>
-        <w:pageBreakBefore/>
+        <w:spacing w:after="300" w:before="360"/>
       </w:pPr>
       <w:r>
         <w:rPr>
@@ -9364,7 +9364,7 @@
     <w:p>
       <w:pPr>
         <w:pStyle w:val="Heading1"/>
-        <w:pageBreakBefore/>
+        <w:spacing w:after="300" w:before="360"/>
       </w:pPr>
       <w:r>
         <w:rPr>
@@ -14263,7 +14263,7 @@
     <w:p>
       <w:pPr>
         <w:pStyle w:val="Heading1"/>
-        <w:pageBreakBefore/>
+        <w:spacing w:after="300" w:before="360"/>
       </w:pPr>
       <w:r>
         <w:rPr>
@@ -15883,7 +15883,7 @@
     <w:p>
       <w:pPr>
         <w:pStyle w:val="Heading1"/>
-        <w:pageBreakBefore/>
+        <w:spacing w:after="300" w:before="360"/>
       </w:pPr>
       <w:r>
         <w:rPr>
@@ -16129,7 +16129,7 @@
     <w:p>
       <w:pPr>
         <w:pStyle w:val="Heading1"/>
-        <w:pageBreakBefore/>
+        <w:spacing w:after="300" w:before="360"/>
       </w:pPr>
       <w:r>
         <w:rPr>
@@ -16188,7 +16188,7 @@
       <w:r>
         <w:drawing>
           <wp:inline distT="0" distB="0" distL="0" distR="0">
-            <wp:extent cx="5334000" cy="4248150"/>
+            <wp:extent cx="3467100" cy="2762250"/>
             <wp:effectExtent t="0" r="0" b="0" l="0"/>
             <wp:docPr id="1" name="uc" descr="UML use case diagram of the system" title="Figure: UML use case diagram of the system"/>
             <wp:cNvGraphicFramePr>
@@ -16213,7 +16213,7 @@
                   <pic:spPr bwMode="auto">
                     <a:xfrm>
                       <a:off x="0" y="0"/>
-                      <a:ext cx="5334000" cy="4248150"/>
+                      <a:ext cx="3467100" cy="2762250"/>
                     </a:xfrm>
                     <a:prstGeom prst="rect">
                       <a:avLst/>
@@ -16456,7 +16456,7 @@
       <w:r>
         <w:drawing>
           <wp:inline distT="0" distB="0" distL="0" distR="0">
-            <wp:extent cx="5257800" cy="5334000"/>
+            <wp:extent cx="3000375" cy="3048000"/>
             <wp:effectExtent t="0" r="0" b="0" l="0"/>
             <wp:docPr id="1" name="cls" descr="UML class diagram" title="Figure: UML class diagram"/>
             <wp:cNvGraphicFramePr>
@@ -16481,7 +16481,7 @@
                   <pic:spPr bwMode="auto">
                     <a:xfrm>
                       <a:off x="0" y="0"/>
-                      <a:ext cx="5257800" cy="5334000"/>
+                      <a:ext cx="3000375" cy="3048000"/>
                     </a:xfrm>
                     <a:prstGeom prst="rect">
                       <a:avLst/>
@@ -16580,7 +16580,7 @@
       <w:r>
         <w:drawing>
           <wp:inline distT="0" distB="0" distL="0" distR="0">
-            <wp:extent cx="5200650" cy="5715000"/>
+            <wp:extent cx="2857500" cy="3143250"/>
             <wp:effectExtent t="0" r="0" b="0" l="0"/>
             <wp:docPr id="1" name="seq" descr="UML sequence diagram of closure verification" title="Figure: UML sequence diagram of closure verification"/>
             <wp:cNvGraphicFramePr>
@@ -16605,7 +16605,7 @@
                   <pic:spPr bwMode="auto">
                     <a:xfrm>
                       <a:off x="0" y="0"/>
-                      <a:ext cx="5200650" cy="5715000"/>
+                      <a:ext cx="2857500" cy="3143250"/>
                     </a:xfrm>
                     <a:prstGeom prst="rect">
                       <a:avLst/>
@@ -16704,7 +16704,7 @@
       <w:r>
         <w:drawing>
           <wp:inline distT="0" distB="0" distL="0" distR="0">
-            <wp:extent cx="5200650" cy="5715000"/>
+            <wp:extent cx="2943225" cy="3238500"/>
             <wp:effectExtent t="0" r="0" b="0" l="0"/>
             <wp:docPr id="1" name="act" descr="UML activity diagram of the verification workflow" title="Figure: UML activity diagram of the verification workflow"/>
             <wp:cNvGraphicFramePr>
@@ -16729,7 +16729,7 @@
                   <pic:spPr bwMode="auto">
                     <a:xfrm>
                       <a:off x="0" y="0"/>
-                      <a:ext cx="5200650" cy="5715000"/>
+                      <a:ext cx="2943225" cy="3238500"/>
                     </a:xfrm>
                     <a:prstGeom prst="rect">
                       <a:avLst/>
@@ -16828,7 +16828,7 @@
       <w:r>
         <w:drawing>
           <wp:inline distT="0" distB="0" distL="0" distR="0">
-            <wp:extent cx="5334000" cy="3981450"/>
+            <wp:extent cx="3705225" cy="2762250"/>
             <wp:effectExtent t="0" r="0" b="0" l="0"/>
             <wp:docPr id="1" name="comp" descr="UML component diagram" title="Figure: UML component diagram"/>
             <wp:cNvGraphicFramePr>
@@ -16853,7 +16853,7 @@
                   <pic:spPr bwMode="auto">
                     <a:xfrm>
                       <a:off x="0" y="0"/>
-                      <a:ext cx="5334000" cy="3981450"/>
+                      <a:ext cx="3705225" cy="2762250"/>
                     </a:xfrm>
                     <a:prstGeom prst="rect">
                       <a:avLst/>
@@ -16952,7 +16952,7 @@
       <w:r>
         <w:drawing>
           <wp:inline distT="0" distB="0" distL="0" distR="0">
-            <wp:extent cx="5334000" cy="3619500"/>
+            <wp:extent cx="4067175" cy="2762250"/>
             <wp:effectExtent t="0" r="0" b="0" l="0"/>
             <wp:docPr id="1" name="dep" descr="UML deployment diagram" title="Figure: UML deployment diagram"/>
             <wp:cNvGraphicFramePr>
@@ -16977,7 +16977,7 @@
                   <pic:spPr bwMode="auto">
                     <a:xfrm>
                       <a:off x="0" y="0"/>
-                      <a:ext cx="5334000" cy="3619500"/>
+                      <a:ext cx="4067175" cy="2762250"/>
                     </a:xfrm>
                     <a:prstGeom prst="rect">
                       <a:avLst/>
@@ -17076,7 +17076,7 @@
       <w:r>
         <w:drawing>
           <wp:inline distT="0" distB="0" distL="0" distR="0">
-            <wp:extent cx="5334000" cy="4067175"/>
+            <wp:extent cx="3619500" cy="2762250"/>
             <wp:effectExtent t="0" r="0" b="0" l="0"/>
             <wp:docPr id="1" name="st" descr="UML state machine diagram" title="Figure: UML state machine diagram"/>
             <wp:cNvGraphicFramePr>
@@ -17101,7 +17101,7 @@
                   <pic:spPr bwMode="auto">
                     <a:xfrm>
                       <a:off x="0" y="0"/>
-                      <a:ext cx="5334000" cy="4067175"/>
+                      <a:ext cx="3619500" cy="2762250"/>
                     </a:xfrm>
                     <a:prstGeom prst="rect">
                       <a:avLst/>
@@ -17200,7 +17200,7 @@
       <w:r>
         <w:drawing>
           <wp:inline distT="0" distB="0" distL="0" distR="0">
-            <wp:extent cx="5334000" cy="3895725"/>
+            <wp:extent cx="3781425" cy="2762250"/>
             <wp:effectExtent t="0" r="0" b="0" l="0"/>
             <wp:docPr id="1" name="comm" descr="UML communication diagram" title="Figure: UML communication diagram"/>
             <wp:cNvGraphicFramePr>
@@ -17225,7 +17225,7 @@
                   <pic:spPr bwMode="auto">
                     <a:xfrm>
                       <a:off x="0" y="0"/>
-                      <a:ext cx="5334000" cy="3895725"/>
+                      <a:ext cx="3781425" cy="2762250"/>
                     </a:xfrm>
                     <a:prstGeom prst="rect">
                       <a:avLst/>
@@ -18276,7 +18276,7 @@
     <w:p>
       <w:pPr>
         <w:pStyle w:val="Heading1"/>
-        <w:pageBreakBefore/>
+        <w:spacing w:after="300" w:before="360"/>
       </w:pPr>
       <w:r>
         <w:rPr>
@@ -20213,7 +20213,7 @@
     <w:p>
       <w:pPr>
         <w:pStyle w:val="Heading1"/>
-        <w:pageBreakBefore/>
+        <w:spacing w:after="300" w:before="360"/>
       </w:pPr>
       <w:r>
         <w:rPr>
@@ -22195,7 +22195,7 @@
     <w:p>
       <w:pPr>
         <w:pStyle w:val="Heading1"/>
-        <w:pageBreakBefore/>
+        <w:spacing w:after="300" w:before="360"/>
       </w:pPr>
       <w:r>
         <w:rPr>
@@ -26622,7 +26622,7 @@
     <w:p>
       <w:pPr>
         <w:pStyle w:val="Heading1"/>
-        <w:pageBreakBefore/>
+        <w:spacing w:after="300" w:before="360"/>
       </w:pPr>
       <w:r>
         <w:rPr>
@@ -31251,7 +31251,7 @@
     <w:p>
       <w:pPr>
         <w:pStyle w:val="Heading1"/>
-        <w:pageBreakBefore/>
+        <w:spacing w:after="300" w:before="360"/>
       </w:pPr>
       <w:r>
         <w:rPr>
@@ -32211,7 +32211,7 @@
     <w:p>
       <w:pPr>
         <w:pStyle w:val="Heading1"/>
-        <w:pageBreakBefore/>
+        <w:spacing w:after="300" w:before="360"/>
       </w:pPr>
       <w:r>
         <w:rPr>
@@ -33777,7 +33777,7 @@
     <w:p>
       <w:pPr>
         <w:pStyle w:val="Heading1"/>
-        <w:pageBreakBefore/>
+        <w:spacing w:after="300" w:before="360"/>
       </w:pPr>
       <w:r>
         <w:rPr>
@@ -35457,7 +35457,7 @@
     <w:p>
       <w:pPr>
         <w:pStyle w:val="Heading1"/>
-        <w:pageBreakBefore/>
+        <w:spacing w:after="300" w:before="360"/>
       </w:pPr>
       <w:r>
         <w:rPr>

</xml_diff>